<commit_message>
Add Photography Identity and Framework Diagram sections to founder approval doc
Adds Section 8 (Photography Identity) with style words, scene direction,
color treatment, and photography principles — plus decisions on whether
original assets exist or a shoot is needed. Adds Section 9 (Framework
Diagram) with the Rose anatomy mapping (Roots/Stem/Bloom = Foundation/
Practice/Awakening) for founder approval before designer creates the
diagram. Document now has 11 sections covering all outstanding content.

https://claude.ai/code/session_01J6KVRuBh74o9xyttaWvBMV
</commit_message>
<xml_diff>
--- a/docs/brand/ROSES-OS-Brand-Book-Founder-Approval.docx
+++ b/docs/brand/ROSES-OS-Brand-Book-Founder-Approval.docx
@@ -173,7 +173,7 @@
         <w:rPr>
           <w:sz w:val="22"/>
         </w:rPr>
-        <w:t>Section 8: Butterfly Wing — Pending Decisions</w:t>
+        <w:t>Section 8: Photography Identity</w:t>
       </w:r>
     </w:p>
     <w:p>
@@ -181,7 +181,23 @@
         <w:rPr>
           <w:sz w:val="22"/>
         </w:rPr>
-        <w:t>Section 9: Brand Story / Origin Narrative — Interview Questions</w:t>
+        <w:t>Section 9: Framework Diagram — The Rose as Brand Architecture</w:t>
+      </w:r>
+    </w:p>
+    <w:p>
+      <w:r>
+        <w:rPr>
+          <w:sz w:val="22"/>
+        </w:rPr>
+        <w:t>Section 10: Butterfly Wing — Pending Decisions</w:t>
+      </w:r>
+    </w:p>
+    <w:p>
+      <w:r>
+        <w:rPr>
+          <w:sz w:val="22"/>
+        </w:rPr>
+        <w:t>Section 11: Brand Story / Origin Narrative — Interview Questions</w:t>
       </w:r>
     </w:p>
     <w:p>
@@ -3878,7 +3894,846 @@
         <w:pStyle w:val="Heading1"/>
       </w:pPr>
       <w:r>
-        <w:t>Section 8: The Butterfly Wing — Pending Decisions</w:t>
+        <w:t>Section 8: Photography Identity</w:t>
+      </w:r>
+    </w:p>
+    <w:p>
+      <w:r>
+        <w:t>The photographic style of ROSES OS — defining how imagery feels across the brand book, website, social media, and all materials. This direction needs founder approval and a decision on whether original photography assets exist or need to be commissioned.</w:t>
+      </w:r>
+    </w:p>
+    <w:p>
+      <w:pPr>
+        <w:pStyle w:val="Heading2"/>
+      </w:pPr>
+      <w:r>
+        <w:t>The ROSES OS Photographic Style</w:t>
+      </w:r>
+    </w:p>
+    <w:p>
+      <w:r>
+        <w:t>Our imagery reflects our essence: grounded, warm, quiet.</w:t>
+      </w:r>
+    </w:p>
+    <w:p>
+      <w:pPr>
+        <w:pStyle w:val="Heading3"/>
+      </w:pPr>
+      <w:r>
+        <w:t>Style Words</w:t>
+      </w:r>
+    </w:p>
+    <w:p>
+      <w:pPr>
+        <w:spacing w:after="40"/>
+        <w:ind w:left="360"/>
+      </w:pPr>
+      <w:r>
+        <w:rPr>
+          <w:sz w:val="22"/>
+        </w:rPr>
+        <w:t>•  Earthy</w:t>
+      </w:r>
+    </w:p>
+    <w:p>
+      <w:pPr>
+        <w:spacing w:after="40"/>
+        <w:ind w:left="360"/>
+      </w:pPr>
+      <w:r>
+        <w:rPr>
+          <w:sz w:val="22"/>
+        </w:rPr>
+        <w:t>•  Warm</w:t>
+      </w:r>
+    </w:p>
+    <w:p>
+      <w:pPr>
+        <w:spacing w:after="40"/>
+        <w:ind w:left="360"/>
+      </w:pPr>
+      <w:r>
+        <w:rPr>
+          <w:sz w:val="22"/>
+        </w:rPr>
+        <w:t>•  Still</w:t>
+      </w:r>
+    </w:p>
+    <w:p>
+      <w:pPr>
+        <w:spacing w:after="40"/>
+        <w:ind w:left="360"/>
+      </w:pPr>
+      <w:r>
+        <w:rPr>
+          <w:sz w:val="22"/>
+        </w:rPr>
+        <w:t>•  Intimate</w:t>
+      </w:r>
+    </w:p>
+    <w:p>
+      <w:pPr>
+        <w:spacing w:after="40"/>
+        <w:ind w:left="360"/>
+      </w:pPr>
+      <w:r>
+        <w:rPr>
+          <w:sz w:val="22"/>
+        </w:rPr>
+        <w:t>•  Textured</w:t>
+      </w:r>
+    </w:p>
+    <w:p>
+      <w:pPr>
+        <w:spacing w:after="40"/>
+        <w:ind w:left="360"/>
+      </w:pPr>
+      <w:r>
+        <w:rPr>
+          <w:sz w:val="22"/>
+        </w:rPr>
+        <w:t>•  Natural light</w:t>
+      </w:r>
+    </w:p>
+    <w:p>
+      <w:pPr>
+        <w:spacing w:after="40"/>
+        <w:ind w:left="360"/>
+      </w:pPr>
+      <w:r>
+        <w:rPr>
+          <w:sz w:val="22"/>
+        </w:rPr>
+        <w:t>•  Unhurried</w:t>
+      </w:r>
+    </w:p>
+    <w:p>
+      <w:pPr>
+        <w:pStyle w:val="Heading3"/>
+      </w:pPr>
+      <w:r>
+        <w:t>Scene Direction</w:t>
+      </w:r>
+    </w:p>
+    <w:p>
+      <w:pPr>
+        <w:spacing w:after="40"/>
+        <w:ind w:left="360"/>
+      </w:pPr>
+      <w:r>
+        <w:rPr>
+          <w:sz w:val="21"/>
+        </w:rPr>
+        <w:t>•  Hands in practice (meditation, journaling, tea ceremony)</w:t>
+      </w:r>
+    </w:p>
+    <w:p>
+      <w:pPr>
+        <w:spacing w:after="40"/>
+        <w:ind w:left="360"/>
+      </w:pPr>
+      <w:r>
+        <w:rPr>
+          <w:sz w:val="21"/>
+        </w:rPr>
+        <w:t>•  Earth textures close-up (clay, stone, linen, wood grain)</w:t>
+      </w:r>
+    </w:p>
+    <w:p>
+      <w:pPr>
+        <w:spacing w:after="40"/>
+        <w:ind w:left="360"/>
+      </w:pPr>
+      <w:r>
+        <w:rPr>
+          <w:sz w:val="21"/>
+        </w:rPr>
+        <w:t>•  Natural light through windows, golden hour, morning quiet</w:t>
+      </w:r>
+    </w:p>
+    <w:p>
+      <w:pPr>
+        <w:spacing w:after="40"/>
+        <w:ind w:left="360"/>
+      </w:pPr>
+      <w:r>
+        <w:rPr>
+          <w:sz w:val="21"/>
+        </w:rPr>
+        <w:t>•  Human presence in presence (eyes closed, seated, fully there)</w:t>
+      </w:r>
+    </w:p>
+    <w:p>
+      <w:pPr>
+        <w:spacing w:after="40"/>
+        <w:ind w:left="360"/>
+      </w:pPr>
+      <w:r>
+        <w:rPr>
+          <w:sz w:val="21"/>
+        </w:rPr>
+        <w:t>•  Community in stillness (circles, shared meals, deep listening)</w:t>
+      </w:r>
+    </w:p>
+    <w:p>
+      <w:pPr>
+        <w:spacing w:after="40"/>
+        <w:ind w:left="360"/>
+      </w:pPr>
+      <w:r>
+        <w:rPr>
+          <w:sz w:val="21"/>
+        </w:rPr>
+        <w:t>•  Architecture of sacred spaces (clean lines, warm materials)</w:t>
+      </w:r>
+    </w:p>
+    <w:p>
+      <w:pPr>
+        <w:spacing w:after="40"/>
+        <w:ind w:left="360"/>
+      </w:pPr>
+      <w:r>
+        <w:rPr>
+          <w:sz w:val="21"/>
+        </w:rPr>
+        <w:t>•  Nature as mirror (roots, water, stone, open sky)</w:t>
+      </w:r>
+    </w:p>
+    <w:p>
+      <w:pPr>
+        <w:pStyle w:val="Heading3"/>
+      </w:pPr>
+      <w:r>
+        <w:t>Color Treatment</w:t>
+      </w:r>
+    </w:p>
+    <w:p>
+      <w:pPr>
+        <w:spacing w:after="40"/>
+        <w:ind w:left="360"/>
+      </w:pPr>
+      <w:r>
+        <w:rPr>
+          <w:sz w:val="21"/>
+        </w:rPr>
+        <w:t>•  Warm tones, desaturated</w:t>
+      </w:r>
+    </w:p>
+    <w:p>
+      <w:pPr>
+        <w:spacing w:after="40"/>
+        <w:ind w:left="360"/>
+      </w:pPr>
+      <w:r>
+        <w:rPr>
+          <w:sz w:val="21"/>
+        </w:rPr>
+        <w:t>•  Earth palette extending into every image</w:t>
+      </w:r>
+    </w:p>
+    <w:p>
+      <w:pPr>
+        <w:spacing w:after="40"/>
+        <w:ind w:left="360"/>
+      </w:pPr>
+      <w:r>
+        <w:rPr>
+          <w:sz w:val="21"/>
+        </w:rPr>
+        <w:t>•  Soft, lived-in warmth — the feeling of linen and clay</w:t>
+      </w:r>
+    </w:p>
+    <w:p>
+      <w:pPr>
+        <w:spacing w:after="40"/>
+        <w:ind w:left="360"/>
+      </w:pPr>
+      <w:r>
+        <w:rPr>
+          <w:sz w:val="21"/>
+        </w:rPr>
+        <w:t>•  Black and white: selective, for emphasis and reverence</w:t>
+      </w:r>
+    </w:p>
+    <w:p>
+      <w:pPr>
+        <w:pStyle w:val="Heading3"/>
+      </w:pPr>
+      <w:r>
+        <w:t>Photography Principles</w:t>
+      </w:r>
+    </w:p>
+    <w:p>
+      <w:pPr>
+        <w:spacing w:after="40"/>
+        <w:ind w:left="360"/>
+      </w:pPr>
+      <w:r>
+        <w:rPr>
+          <w:sz w:val="21"/>
+        </w:rPr>
+        <w:t>•  Every image should feel authentic and present</w:t>
+      </w:r>
+    </w:p>
+    <w:p>
+      <w:pPr>
+        <w:spacing w:after="40"/>
+        <w:ind w:left="360"/>
+      </w:pPr>
+      <w:r>
+        <w:rPr>
+          <w:sz w:val="21"/>
+        </w:rPr>
+        <w:t>•  Composition is spacious — room to breathe</w:t>
+      </w:r>
+    </w:p>
+    <w:p>
+      <w:pPr>
+        <w:spacing w:after="40"/>
+        <w:ind w:left="360"/>
+      </w:pPr>
+      <w:r>
+        <w:rPr>
+          <w:sz w:val="21"/>
+        </w:rPr>
+        <w:t>•  Light is always natural — golden hour, morning quiet, soft window light</w:t>
+      </w:r>
+    </w:p>
+    <w:p>
+      <w:pPr>
+        <w:spacing w:after="40"/>
+        <w:ind w:left="360"/>
+      </w:pPr>
+      <w:r>
+        <w:rPr>
+          <w:sz w:val="21"/>
+        </w:rPr>
+        <w:t>•  People are captured in real moments of presence</w:t>
+      </w:r>
+    </w:p>
+    <w:p>
+      <w:pPr>
+        <w:spacing w:after="40"/>
+        <w:ind w:left="360"/>
+      </w:pPr>
+      <w:r>
+        <w:rPr>
+          <w:sz w:val="21"/>
+        </w:rPr>
+        <w:t>•  The feeling of the photograph matters as much as its content</w:t>
+      </w:r>
+    </w:p>
+    <w:p/>
+    <w:p>
+      <w:pPr>
+        <w:spacing w:before="240"/>
+      </w:pPr>
+      <w:r>
+        <w:rPr>
+          <w:b/>
+          <w:color w:val="9C6F6E"/>
+          <w:sz w:val="22"/>
+        </w:rPr>
+        <w:t>DECISIONS NEEDED</w:t>
+      </w:r>
+    </w:p>
+    <w:p>
+      <w:pPr>
+        <w:spacing w:after="40"/>
+        <w:ind w:left="360"/>
+      </w:pPr>
+      <w:r>
+        <w:rPr>
+          <w:color w:val="3F3E3C"/>
+          <w:sz w:val="21"/>
+        </w:rPr>
+        <w:t>☐  Approve or modify the photographic style direction above</w:t>
+      </w:r>
+    </w:p>
+    <w:p>
+      <w:pPr>
+        <w:spacing w:after="40"/>
+        <w:ind w:left="360"/>
+      </w:pPr>
+      <w:r>
+        <w:rPr>
+          <w:color w:val="3F3E3C"/>
+          <w:sz w:val="21"/>
+        </w:rPr>
+        <w:t>☐  Do original photography assets exist, or does a shoot need to be commissioned?</w:t>
+      </w:r>
+    </w:p>
+    <w:p>
+      <w:pPr>
+        <w:spacing w:after="40"/>
+        <w:ind w:left="360"/>
+      </w:pPr>
+      <w:r>
+        <w:rPr>
+          <w:color w:val="3F3E3C"/>
+          <w:sz w:val="21"/>
+        </w:rPr>
+        <w:t>☐  Should the photography guide include specific shoot briefs (headshots, environment, practice, community)?</w:t>
+      </w:r>
+    </w:p>
+    <w:p>
+      <w:pPr>
+        <w:spacing w:after="40"/>
+        <w:ind w:left="360"/>
+      </w:pPr>
+      <w:r>
+        <w:rPr>
+          <w:color w:val="3F3E3C"/>
+          <w:sz w:val="21"/>
+        </w:rPr>
+        <w:t>☐  Are there existing images from CELARIS or events that could be adapted for the brand book?</w:t>
+      </w:r>
+    </w:p>
+    <w:p>
+      <w:pPr>
+        <w:spacing w:before="240"/>
+      </w:pPr>
+      <w:r>
+        <w:rPr>
+          <w:b/>
+          <w:color w:val="9E956B"/>
+          <w:sz w:val="20"/>
+        </w:rPr>
+        <w:t>FOUNDER NOTES:</w:t>
+      </w:r>
+    </w:p>
+    <w:p>
+      <w:pPr>
+        <w:spacing w:after="160"/>
+      </w:pPr>
+      <w:r>
+        <w:rPr>
+          <w:color w:val="C7AE8C"/>
+          <w:sz w:val="18"/>
+        </w:rPr>
+        <w:t>________________________________________________________________________________</w:t>
+      </w:r>
+    </w:p>
+    <w:p>
+      <w:pPr>
+        <w:spacing w:after="160"/>
+      </w:pPr>
+      <w:r>
+        <w:rPr>
+          <w:color w:val="C7AE8C"/>
+          <w:sz w:val="18"/>
+        </w:rPr>
+        <w:t>________________________________________________________________________________</w:t>
+      </w:r>
+    </w:p>
+    <w:p>
+      <w:pPr>
+        <w:spacing w:after="160"/>
+      </w:pPr>
+      <w:r>
+        <w:rPr>
+          <w:color w:val="C7AE8C"/>
+          <w:sz w:val="18"/>
+        </w:rPr>
+        <w:t>________________________________________________________________________________</w:t>
+      </w:r>
+    </w:p>
+    <w:p>
+      <w:pPr>
+        <w:spacing w:after="160"/>
+      </w:pPr>
+      <w:r>
+        <w:rPr>
+          <w:color w:val="C7AE8C"/>
+          <w:sz w:val="18"/>
+        </w:rPr>
+        <w:t>________________________________________________________________________________</w:t>
+      </w:r>
+    </w:p>
+    <w:p>
+      <w:r>
+        <w:br w:type="page"/>
+      </w:r>
+    </w:p>
+    <w:p>
+      <w:pPr>
+        <w:pStyle w:val="Heading1"/>
+      </w:pPr>
+      <w:r>
+        <w:t>Section 9: The Rose as Brand Framework</w:t>
+      </w:r>
+    </w:p>
+    <w:p>
+      <w:r>
+        <w:t>The Zunya Brand Book centers on the "Seed of Life" sacred geometry diagram as its organizing visual. ROSES OS needs an equivalent — the Rose itself as a visual framework that maps to the brand architecture. This concept needs founder approval before the designer creates the diagram.</w:t>
+      </w:r>
+    </w:p>
+    <w:p>
+      <w:pPr>
+        <w:pStyle w:val="Heading2"/>
+      </w:pPr>
+      <w:r>
+        <w:t>Concept: Rose Anatomy = Brand Architecture</w:t>
+      </w:r>
+    </w:p>
+    <w:p>
+      <w:r>
+        <w:t>The Rose has a natural three-part anatomy that maps directly to the ROSES OS brand layers:</w:t>
+      </w:r>
+    </w:p>
+    <w:tbl>
+      <w:tblPr>
+        <w:tblW w:type="auto" w:w="0"/>
+        <w:jc w:val="center"/>
+        <w:tblLook w:firstColumn="1" w:firstRow="1" w:lastColumn="0" w:lastRow="0" w:noHBand="0" w:noVBand="1" w:val="04A0"/>
+      </w:tblPr>
+      <w:tblGrid>
+        <w:gridCol w:w="2880"/>
+        <w:gridCol w:w="2880"/>
+        <w:gridCol w:w="2880"/>
+      </w:tblGrid>
+      <w:tr>
+        <w:tc>
+          <w:tcPr>
+            <w:tcW w:type="dxa" w:w="2880"/>
+            <w:shd w:val="clear" w:color="auto" w:fill="EEEEEE"/>
+          </w:tcPr>
+          <w:p>
+            <w:r>
+              <w:rPr>
+                <w:b/>
+                <w:sz w:val="20"/>
+              </w:rPr>
+              <w:t>Rose Part</w:t>
+            </w:r>
+          </w:p>
+        </w:tc>
+        <w:tc>
+          <w:tcPr>
+            <w:tcW w:type="dxa" w:w="2880"/>
+            <w:shd w:val="clear" w:color="auto" w:fill="EEEEEE"/>
+          </w:tcPr>
+          <w:p>
+            <w:r>
+              <w:rPr>
+                <w:b/>
+                <w:sz w:val="20"/>
+              </w:rPr>
+              <w:t>Brand Layer</w:t>
+            </w:r>
+          </w:p>
+        </w:tc>
+        <w:tc>
+          <w:tcPr>
+            <w:tcW w:type="dxa" w:w="2880"/>
+            <w:shd w:val="clear" w:color="auto" w:fill="EEEEEE"/>
+          </w:tcPr>
+          <w:p>
+            <w:r>
+              <w:rPr>
+                <w:b/>
+                <w:sz w:val="20"/>
+              </w:rPr>
+              <w:t>Description</w:t>
+            </w:r>
+          </w:p>
+        </w:tc>
+      </w:tr>
+      <w:tr>
+        <w:tc>
+          <w:tcPr>
+            <w:tcW w:type="dxa" w:w="2880"/>
+          </w:tcPr>
+          <w:p>
+            <w:r>
+              <w:rPr>
+                <w:b/>
+                <w:color w:val="9C6F6E"/>
+                <w:sz w:val="20"/>
+              </w:rPr>
+              <w:t>ROOTS</w:t>
+            </w:r>
+          </w:p>
+        </w:tc>
+        <w:tc>
+          <w:tcPr>
+            <w:tcW w:type="dxa" w:w="2880"/>
+          </w:tcPr>
+          <w:p>
+            <w:r>
+              <w:rPr>
+                <w:b/>
+                <w:sz w:val="20"/>
+              </w:rPr>
+              <w:t>Foundation</w:t>
+            </w:r>
+          </w:p>
+        </w:tc>
+        <w:tc>
+          <w:tcPr>
+            <w:tcW w:type="dxa" w:w="2880"/>
+          </w:tcPr>
+          <w:p>
+            <w:r>
+              <w:rPr>
+                <w:sz w:val="19"/>
+              </w:rPr>
+              <w:t>The lineage, the source, the grounding. Where the work comes from. 30+ years of transmission from Bostwick → Plunk → Angelina.</w:t>
+            </w:r>
+          </w:p>
+        </w:tc>
+      </w:tr>
+      <w:tr>
+        <w:tc>
+          <w:tcPr>
+            <w:tcW w:type="dxa" w:w="2880"/>
+          </w:tcPr>
+          <w:p>
+            <w:r>
+              <w:rPr>
+                <w:b/>
+                <w:color w:val="9C6F6E"/>
+                <w:sz w:val="20"/>
+              </w:rPr>
+              <w:t>STEM</w:t>
+            </w:r>
+          </w:p>
+        </w:tc>
+        <w:tc>
+          <w:tcPr>
+            <w:tcW w:type="dxa" w:w="2880"/>
+          </w:tcPr>
+          <w:p>
+            <w:r>
+              <w:rPr>
+                <w:b/>
+                <w:sz w:val="20"/>
+              </w:rPr>
+              <w:t>Practice</w:t>
+            </w:r>
+          </w:p>
+        </w:tc>
+        <w:tc>
+          <w:tcPr>
+            <w:tcW w:type="dxa" w:w="2880"/>
+          </w:tcPr>
+          <w:p>
+            <w:r>
+              <w:rPr>
+                <w:sz w:val="19"/>
+              </w:rPr>
+              <w:t>The channel, the daily work, the living discipline. How you do it. The Rose meditation, Levels 1–3, the daily return.</w:t>
+            </w:r>
+          </w:p>
+        </w:tc>
+      </w:tr>
+      <w:tr>
+        <w:tc>
+          <w:tcPr>
+            <w:tcW w:type="dxa" w:w="2880"/>
+          </w:tcPr>
+          <w:p>
+            <w:r>
+              <w:rPr>
+                <w:b/>
+                <w:color w:val="9C6F6E"/>
+                <w:sz w:val="20"/>
+              </w:rPr>
+              <w:t>BLOOM</w:t>
+            </w:r>
+          </w:p>
+        </w:tc>
+        <w:tc>
+          <w:tcPr>
+            <w:tcW w:type="dxa" w:w="2880"/>
+          </w:tcPr>
+          <w:p>
+            <w:r>
+              <w:rPr>
+                <w:b/>
+                <w:sz w:val="20"/>
+              </w:rPr>
+              <w:t>Awakening</w:t>
+            </w:r>
+          </w:p>
+        </w:tc>
+        <w:tc>
+          <w:tcPr>
+            <w:tcW w:type="dxa" w:w="2880"/>
+          </w:tcPr>
+          <w:p>
+            <w:r>
+              <w:rPr>
+                <w:sz w:val="19"/>
+              </w:rPr>
+              <w:t>The radiance, the genius, the coherence. What emerges. The Six Pillars, leadership, your highest potential.</w:t>
+            </w:r>
+          </w:p>
+        </w:tc>
+      </w:tr>
+    </w:tbl>
+    <w:p/>
+    <w:p>
+      <w:pPr>
+        <w:pStyle w:val="Heading2"/>
+      </w:pPr>
+      <w:r>
+        <w:t>How It Works in the Brand Book</w:t>
+      </w:r>
+    </w:p>
+    <w:p>
+      <w:r>
+        <w:t>This framework becomes a visual diagram — a single illustration of the Rose with its three layers labeled — that appears early in the brand book (after the Manifest, before the detailed sections). It serves as a visual map: the reader sees the whole architecture before exploring each part.</w:t>
+      </w:r>
+    </w:p>
+    <w:p/>
+    <w:p>
+      <w:r>
+        <w:rPr>
+          <w:b/>
+        </w:rPr>
+        <w:t xml:space="preserve">Unifying statement (draft): </w:t>
+      </w:r>
+    </w:p>
+    <w:p>
+      <w:pPr>
+        <w:spacing w:before="160" w:after="160"/>
+        <w:ind w:left="720"/>
+      </w:pPr>
+      <w:r>
+        <w:rPr>
+          <w:i/>
+          <w:color w:val="9C6F6E"/>
+          <w:sz w:val="22"/>
+        </w:rPr>
+        <w:t>“The Rose is not a symbol. It is the architecture. Roots hold the lineage. The stem carries the practice. The bloom is what awakens when coherence returns.”</w:t>
+      </w:r>
+    </w:p>
+    <w:p/>
+    <w:p>
+      <w:pPr>
+        <w:spacing w:before="240"/>
+      </w:pPr>
+      <w:r>
+        <w:rPr>
+          <w:b/>
+          <w:color w:val="9C6F6E"/>
+          <w:sz w:val="22"/>
+        </w:rPr>
+        <w:t>DECISIONS NEEDED</w:t>
+      </w:r>
+    </w:p>
+    <w:p>
+      <w:pPr>
+        <w:spacing w:after="40"/>
+        <w:ind w:left="360"/>
+      </w:pPr>
+      <w:r>
+        <w:rPr>
+          <w:color w:val="3F3E3C"/>
+          <w:sz w:val="21"/>
+        </w:rPr>
+        <w:t>☐  Does the three-part mapping (Roots/Stem/Bloom = Foundation/Practice/Awakening) feel right?</w:t>
+      </w:r>
+    </w:p>
+    <w:p>
+      <w:pPr>
+        <w:spacing w:after="40"/>
+        <w:ind w:left="360"/>
+      </w:pPr>
+      <w:r>
+        <w:rPr>
+          <w:color w:val="3F3E3C"/>
+          <w:sz w:val="21"/>
+        </w:rPr>
+        <w:t>☐  Should the diagram be botanical (naturalistic illustration) or abstract (geometric/minimal)?</w:t>
+      </w:r>
+    </w:p>
+    <w:p>
+      <w:pPr>
+        <w:spacing w:after="40"/>
+        <w:ind w:left="360"/>
+      </w:pPr>
+      <w:r>
+        <w:rPr>
+          <w:color w:val="3F3E3C"/>
+          <w:sz w:val="21"/>
+        </w:rPr>
+        <w:t>☐  Is there a different unifying statement that better captures this framework?</w:t>
+      </w:r>
+    </w:p>
+    <w:p>
+      <w:pPr>
+        <w:spacing w:before="240"/>
+      </w:pPr>
+      <w:r>
+        <w:rPr>
+          <w:b/>
+          <w:color w:val="9E956B"/>
+          <w:sz w:val="20"/>
+        </w:rPr>
+        <w:t>FOUNDER NOTES:</w:t>
+      </w:r>
+    </w:p>
+    <w:p>
+      <w:pPr>
+        <w:spacing w:after="160"/>
+      </w:pPr>
+      <w:r>
+        <w:rPr>
+          <w:color w:val="C7AE8C"/>
+          <w:sz w:val="18"/>
+        </w:rPr>
+        <w:t>________________________________________________________________________________</w:t>
+      </w:r>
+    </w:p>
+    <w:p>
+      <w:pPr>
+        <w:spacing w:after="160"/>
+      </w:pPr>
+      <w:r>
+        <w:rPr>
+          <w:color w:val="C7AE8C"/>
+          <w:sz w:val="18"/>
+        </w:rPr>
+        <w:t>________________________________________________________________________________</w:t>
+      </w:r>
+    </w:p>
+    <w:p>
+      <w:pPr>
+        <w:spacing w:after="160"/>
+      </w:pPr>
+      <w:r>
+        <w:rPr>
+          <w:color w:val="C7AE8C"/>
+          <w:sz w:val="18"/>
+        </w:rPr>
+        <w:t>________________________________________________________________________________</w:t>
+      </w:r>
+    </w:p>
+    <w:p>
+      <w:pPr>
+        <w:spacing w:after="160"/>
+      </w:pPr>
+      <w:r>
+        <w:rPr>
+          <w:color w:val="C7AE8C"/>
+          <w:sz w:val="18"/>
+        </w:rPr>
+        <w:t>________________________________________________________________________________</w:t>
+      </w:r>
+    </w:p>
+    <w:p>
+      <w:r>
+        <w:br w:type="page"/>
+      </w:r>
+    </w:p>
+    <w:p>
+      <w:pPr>
+        <w:pStyle w:val="Heading1"/>
+      </w:pPr>
+      <w:r>
+        <w:t>Section 10: The Butterfly Wing — Pending Decisions</w:t>
       </w:r>
     </w:p>
     <w:p>
@@ -4175,7 +5030,7 @@
         <w:pStyle w:val="Heading1"/>
       </w:pPr>
       <w:r>
-        <w:t>Section 9: Brand Story / Origin Narrative</w:t>
+        <w:t>Section 11: Brand Story / Origin Narrative</w:t>
       </w:r>
     </w:p>
     <w:p>

</xml_diff>

<commit_message>
Update brand book plan and approval doc to match current website
Sync all brand documentation with live rosesos.com content:
- Stats: 500+ Practitioners → 5,000+ Initiates
- Quote: "revolution of remembrance" → "revolution of consciousness"
- Navigation order: Community before Guardians, Begin as CTA button
- CELARIS: full name (Center of Aura Readings, Reiki, Intuition and Dreams)
- Add new site content: 13 Coherence Domains, Architecture Layers,
  Eleven Capacities, Contribution Tiers, Contact page, Invitation flow
- Expand Six Pillars with full live descriptions
- Expand Community section with live page copy and program details
- Update audience narrative with per-page language differences
- Regenerate founder approval DOCX with all changes

https://claude.ai/code/session_01QcswyKsojSpqGTjh64h32s
</commit_message>
<xml_diff>
--- a/docs/brand/ROSES-OS-Brand-Book-Founder-Approval.docx
+++ b/docs/brand/ROSES-OS-Brand-Book-Founder-Approval.docx
@@ -3638,7 +3638,7 @@
           <w:color w:val="3F3E3C"/>
           <w:sz w:val="20"/>
         </w:rPr>
-        <w:t>The Rose  |  Offerings  |  Guardians  |  Community  |  Begin</w:t>
+        <w:t>The Rose  |  Offerings  |  Community  |  Guardians  |  Begin</w:t>
       </w:r>
     </w:p>
     <w:p>
@@ -5417,7 +5417,7 @@
         <w:rPr>
           <w:sz w:val="21"/>
         </w:rPr>
-        <w:t>2. ROSES OS launched in 2026 as the international expression of a lineage carried for decades through CELARIS (formerly Escola da Aura &amp; Sueños) in Brazil. What made this the right moment to create an international arm with its own identity and architecture?</w:t>
+        <w:t>2. ROSES OS launched in 2026 as the international expression of a lineage carried for decades through CELARIS (Center of Aura Readings, Reiki, Intuition and Dreams) in Brazil. What made this the right moment to create an international arm with its own identity and architecture?</w:t>
       </w:r>
     </w:p>
     <w:p>

</xml_diff>